<commit_message>
Table of contents: bearings, lubrication and seals chapter replaces windage/thermal
Chapter 6 becomes "Bearings, lubrication and seals for high-speed rotors",
the tribology chapter of the author's original plan, with bearing losses,
seals and damage mechanisms collected in one place. Chapter 5 is re-scoped
to rotordynamics and vibration, keeping bearing stiffness and damping only
as rotordynamic inputs. Chapter 9 is retitled "Losses, cooling and the
thermal budget at kilohertz frequencies" and absorbs windage and the
cooling architectures, so that thermal and windage remain visible in the
contents. Budgets net to 446 pages.

Chapter 1's roadmap is updated to match, as a tracked change; the file is
rebuilt, validated and verified (reject-all reproduces the original,
267/267). Annotated_TOC.md and .docx updated accordingly.

Co-Authored-By: Claude Fable 5.1 <noreply@anthropic.com>
Claude-Session: https://claude.ai/code/session_01YTsySEafbpGxYLQMAGUGjT
</commit_message>
<xml_diff>
--- a/chapter1/Annotated_TOC.docx
+++ b/chapter1/Annotated_TOC.docx
@@ -156,7 +156,7 @@
         <w:t>Companion material.</w:t>
       </w:r>
       <w:r>
-        <w:t xml:space="preserve"> A set of Python notebooks reproducing every analytical figure in the book and implementing the design procedures of Chapters 6, 7 and 10, published on the Wiley companion site.</w:t>
+        <w:t xml:space="preserve"> A set of Python notebooks reproducing every analytical figure in the book and implementing the design procedures of Chapters 6, 7, 9 and 10, published on the Wiley companion site.</w:t>
       </w:r>
     </w:p>
     <w:p>
@@ -878,7 +878,7 @@
               <w:rPr>
                 <w:sz w:val="19"/>
               </w:rPr>
-              <w:t>Rotordynamics, bearings and vibration</w:t>
+              <w:t>Rotordynamics and vibration</w:t>
             </w:r>
           </w:p>
         </w:tc>
@@ -896,7 +896,7 @@
               <w:rPr>
                 <w:sz w:val="19"/>
               </w:rPr>
-              <w:t>38</w:t>
+              <w:t>30</w:t>
             </w:r>
           </w:p>
         </w:tc>
@@ -914,7 +914,7 @@
               <w:rPr>
                 <w:sz w:val="19"/>
               </w:rPr>
-              <w:t>14 400</w:t>
+              <w:t>11 400</w:t>
             </w:r>
           </w:p>
         </w:tc>
@@ -932,7 +932,7 @@
               <w:rPr>
                 <w:sz w:val="19"/>
               </w:rPr>
-              <w:t>26</w:t>
+              <w:t>20</w:t>
             </w:r>
           </w:p>
         </w:tc>
@@ -1000,7 +1000,7 @@
               <w:rPr>
                 <w:sz w:val="19"/>
               </w:rPr>
-              <w:t>Windage, air-gap flow and the thermal budget</w:t>
+              <w:t>Bearings, lubrication and seals for high-speed rotors</w:t>
             </w:r>
           </w:p>
         </w:tc>
@@ -1036,7 +1036,7 @@
               <w:rPr>
                 <w:sz w:val="19"/>
               </w:rPr>
-              <w:t>12 600</w:t>
+              <w:t>12 300</w:t>
             </w:r>
           </w:p>
         </w:tc>
@@ -1072,7 +1072,7 @@
               <w:rPr>
                 <w:sz w:val="19"/>
               </w:rPr>
-              <w:t>J. Saari; J. Nerg</w:t>
+              <w:t>J. Sopanen's group; bearing specialist</w:t>
             </w:r>
           </w:p>
         </w:tc>
@@ -1372,7 +1372,7 @@
               <w:rPr>
                 <w:sz w:val="19"/>
               </w:rPr>
-              <w:t>Core and rotor losses at kilohertz frequencies</w:t>
+              <w:t>Losses, cooling and the thermal budget at kilohertz frequencies</w:t>
             </w:r>
           </w:p>
         </w:tc>
@@ -1390,7 +1390,7 @@
               <w:rPr>
                 <w:sz w:val="19"/>
               </w:rPr>
-              <w:t>34</w:t>
+              <w:t>44</w:t>
             </w:r>
           </w:p>
         </w:tc>
@@ -1408,7 +1408,7 @@
               <w:rPr>
                 <w:sz w:val="19"/>
               </w:rPr>
-              <w:t>13 200</w:t>
+              <w:t>17 100</w:t>
             </w:r>
           </w:p>
         </w:tc>
@@ -1426,7 +1426,7 @@
               <w:rPr>
                 <w:sz w:val="19"/>
               </w:rPr>
-              <w:t>22</w:t>
+              <w:t>28</w:t>
             </w:r>
           </w:p>
         </w:tc>
@@ -1444,7 +1444,7 @@
               <w:rPr>
                 <w:sz w:val="19"/>
               </w:rPr>
-              <w:t>A. Belahcen; I. Petrov</w:t>
+              <w:t>A. Belahcen; I. Petrov; J. Saari; J. Nerg</w:t>
             </w:r>
           </w:p>
         </w:tc>
@@ -1880,7 +1880,7 @@
                 <w:b/>
                 <w:sz w:val="19"/>
               </w:rPr>
-              <w:t>404</w:t>
+              <w:t>406</w:t>
             </w:r>
           </w:p>
         </w:tc>
@@ -1899,7 +1899,7 @@
                 <w:b/>
                 <w:sz w:val="19"/>
               </w:rPr>
-              <w:t>156 000</w:t>
+              <w:t>156 600</w:t>
             </w:r>
           </w:p>
         </w:tc>
@@ -2092,7 +2092,7 @@
                 <w:b/>
                 <w:sz w:val="19"/>
               </w:rPr>
-              <w:t>444</w:t>
+              <w:t>446</w:t>
             </w:r>
           </w:p>
         </w:tc>
@@ -2158,7 +2158,7 @@
         <w:t>Two running machines.</w:t>
       </w:r>
       <w:r>
-        <w:t xml:space="preserve"> The two-pole industrial compressor drive and the six-pole Voltcar traction machine are specified in Chapter 2, given their rotor retention in Chapter 4, their rotordynamic verification in Chapter 5, their loss budget in Chapter 6, their electromagnetic sizing in Chapter 7, their windings and losses in Chapters 8 and 9, their converters in Chapter 10, and are assembled into complete, measured designs in Chapters 11 and 12. Every design chapter therefore ends with the same two worked examples, and the reader can follow one machine through the whole procedure.</w:t>
+        <w:t xml:space="preserve"> The two-pole industrial compressor drive and the six-pole Voltcar traction machine are specified in Chapter 2, given their rotor retention in Chapter 4, their rotordynamic verification in Chapter 5, their bearings in Chapter 6, their electromagnetic sizing in Chapter 7, their windings in Chapter 8, their losses and loss budget in Chapter 9, their converters in Chapter 10, and are assembled into complete, measured designs in Chapters 11 and 12. Every design chapter therefore ends with the same two worked examples, and the reader can follow one machine through the whole procedure.</w:t>
       </w:r>
     </w:p>
     <w:p>
@@ -2394,7 +2394,7 @@
         <w:pStyle w:val="Heading4"/>
       </w:pPr>
       <w:r>
-        <w:t>Chapter 5. Rotordynamics, bearings and vibration</w:t>
+        <w:t>Chapter 5. Rotordynamics and vibration</w:t>
       </w:r>
     </w:p>
     <w:p>
@@ -2402,7 +2402,7 @@
         <w:jc w:val="both"/>
       </w:pPr>
       <w:r>
-        <w:t>Along the design path that respects the material limit, the first bending critical speed falls as the cube of the design speed, so most high-speed machines must run supercritically. This chapter makes that manageable. Rigid and flexible rotor behaviour, critical speeds, Campbell diagrams and gyroscopic stiffening are developed for slender rotors with the shaft extensions, sleeves and solid bodies that real machines carry. Subcritical and supercritical operation are compared, and high-speed balancing is treated as a design activity. The bearing options are assessed across three orders of magnitude of cost: hybrid ceramic rolling-element bearings and their Dn limits, fluid-film, air-foil and gas bearings with their whirl instabilities, and active magnetic bearings with their control, sensing and backup requirements. Damping strategies, squeeze-film and active, are the tools for passing through resonance. Electromagnetic force harmonics are linked to structural response, vibration and noise, connecting this chapter to the loss and harmonic content of Chapters 9 and 10. The chapter closes with the rotordynamic verification workflow applied to the two running machines.</w:t>
+        <w:t>Along the design path that respects the material limit, the first bending critical speed falls as the cube of the design speed, so most high-speed machines must run supercritically. This chapter makes that manageable. Rigid and flexible rotor behaviour, critical speeds, Campbell diagrams and gyroscopic stiffening are developed for slender rotors with the shaft extensions, sleeves and solid bodies that real machines carry. Subcritical and supercritical operation are compared, and high-speed balancing is treated as a design activity rather than a workshop afterthought. Bearing stiffness and damping enter as the rotordynamic inputs that Chapter 6 then supplies, and the strategies for passing through resonance, squeeze-film and active damping, are set out. Electromagnetic force harmonics are linked to structural response, vibration and noise, connecting the chapter to the loss and harmonic content of Chapters 9 and 10. The chapter closes with the rotordynamic verification workflow applied to the two running machines.</w:t>
       </w:r>
     </w:p>
     <w:p>
@@ -2410,7 +2410,7 @@
         <w:jc w:val="both"/>
       </w:pPr>
       <w:r>
-        <w:t>Sections: 5.1 Rigid and flexible rotor behaviour · 5.2 Critical speeds, Campbell diagrams, gyroscopic effects · 5.3 Subcritical and supercritical operation · 5.4 High-speed balancing · 5.5 Rolling-element bearings · 5.6 Fluid-film, air-foil and gas bearings · 5.7 Active magnetic bearings · 5.8 Damping: squeeze-film and active · 5.9 Vibration and noise: electromagnetic forces and structural response · 5.10 Rotordynamic verification of the two running machines.</w:t>
+        <w:t>Sections: 5.1 Rigid and flexible rotor behaviour · 5.2 Critical speeds, Campbell diagrams, gyroscopic effects · 5.3 Subcritical and supercritical operation · 5.4 High-speed balancing · 5.5 Bearing stiffness and damping as rotordynamic inputs · 5.6 Passing through resonance: damping strategies · 5.7 Vibration and noise: electromagnetic forces and structural response · 5.8 Rotordynamic verification of the two running machines.</w:t>
       </w:r>
     </w:p>
     <w:p>
@@ -2418,7 +2418,7 @@
         <w:jc w:val="both"/>
       </w:pPr>
       <w:r>
-        <w:t>Budget: 38 pages, 26 figures, 2 tables. Contributors: J. Sopanen's group; 5.9 jointly with A. Belahcen (electromagnetic excitation). DREM boundary: not covered in the earlier book.</w:t>
+        <w:t>Budget: 30 pages, 20 figures, 2 tables. Contributors: J. Sopanen's group; 5.7 jointly with A. Belahcen (electromagnetic excitation). DREM boundary: not covered in the earlier book.</w:t>
       </w:r>
     </w:p>
     <w:p>
@@ -2426,7 +2426,7 @@
         <w:pStyle w:val="Heading4"/>
       </w:pPr>
       <w:r>
-        <w:t>Chapter 6. Windage, air-gap flow and the thermal budget</w:t>
+        <w:t>Chapter 6. Bearings, lubrication and seals for high-speed rotors</w:t>
       </w:r>
     </w:p>
     <w:p>
@@ -2434,7 +2434,7 @@
         <w:jc w:val="both"/>
       </w:pPr>
       <w:r>
-        <w:t>Above roughly 100 m/s the air in the gap stops being a passive medium. Flow in the annulus is developed from laminar Couette flow through Taylor vortices to turbulence, with the friction correlations the designer needs and their experimental validation. Surface roughness, grooving and rotor end effects are quantified, and operation in low-density gas or at reduced pressure is treated for the industrial paradigm. The chapter then turns the thermal problem the right way round for high-speed design: the cooling architecture is chosen early, and it sets the loss budget that the electromagnetic design must meet. Cooling architectures are compared, jackets, in-slot and direct winding cooling, rotor and hollow-shaft cooling, and lumped-parameter thermal networks are built with the air gap treated as a heat source rather than a resistance. Magnet temperature and demagnetisation margin are shown to be the binding thermal constraint in most permanent-magnet high-speed machines. The chapter closes by setting the loss budget for each running machine, which Chapters 8 and 9 must then meet.</w:t>
+        <w:t>The first practical question an industrial reader brings to a high-speed machine is which bearing, lubricated how, lasting how long, and no competing title answers it as a design chapter. This one does, treating the tribology of the support system across three orders of magnitude of cost. Rolling-element bearings are covered with hybrid ceramics, cage design, preload, the lubrication regimes from grease through oil-mist to under-race oil, and Dn limits and life at high speed. Fluid-film bearings, tilting-pad and grooved journal and gas bearings, and air-foil bearings with their lift-off, load capacity and whirl behaviour follow. Active magnetic bearings are treated from actuator sizing and sensing through the control interface and losses to touchdown bearings and drop events. Bearing friction losses are quantified and placed in the loss budget beside windage, where they belong. Seals are given their own section, labyrinth, brush and dry gas seals, seal windage and heating, and the hermetic designs of the industrial paradigm. Damage mechanisms close the technical part, wear, fretting and the tribological face of bearing currents, and the chapter ends with the bearing selection for the two running machines.</w:t>
       </w:r>
     </w:p>
     <w:p>
@@ -2442,7 +2442,7 @@
         <w:jc w:val="both"/>
       </w:pPr>
       <w:r>
-        <w:t>Sections: 6.1 Taylor–Couette flow and regime transition · 6.2 Windage loss models and experimental validation · 6.3 Surface roughness, grooving, rotor end effects · 6.4 Low-density gas and reduced-pressure operation · 6.5 Cooling architectures · 6.6 Lumped-parameter thermal networks for high-speed machines · 6.7 Magnet temperature and demagnetisation margin · 6.8 Setting the loss budget for the two running machines.</w:t>
+        <w:t>Sections: 6.1 The bearing question at high speed: load, Dn, life, loss and cost · 6.2 Rolling-element bearings: hybrid ceramics, cages, preload, lubrication regimes, Dn limits and life · 6.3 Fluid-film bearings: tilting-pad, grooved journal and gas bearings · 6.4 Air-foil bearings · 6.5 Active magnetic bearings: actuators, sensing, control interface, losses, touchdown bearings · 6.6 Bearing friction losses in the loss budget · 6.7 Seals: labyrinth, brush and dry gas seals, seal windage, hermetic designs · 6.8 Damage mechanisms: wear, fretting and bearing currents · 6.9 Bearing selection for the two running machines.</w:t>
       </w:r>
     </w:p>
     <w:p>
@@ -2450,7 +2450,7 @@
         <w:jc w:val="both"/>
       </w:pPr>
       <w:r>
-        <w:t>Budget: 32 pages, 20 figures, 2 tables. Contributors: J. Saari (windage), J. Nerg (thermal networks). DREM boundary: the earlier book's thermal chapter is the starting point; only the high-speed departures are treated.</w:t>
+        <w:t>Budget: 32 pages, 20 figures, 3 tables. Contributors: J. Sopanen's group (bearing-rotor interaction, fluid-film and magnetic bearings); an industrial bearing application specialist to be identified for lubrication, life and seals. DREM boundary: not covered in the earlier book. New: bearing losses and seal windage placed in the high-speed loss budget.</w:t>
       </w:r>
     </w:p>
     <w:p>
@@ -2506,7 +2506,7 @@
         <w:jc w:val="both"/>
       </w:pPr>
       <w:r>
-        <w:t>A slot conductor sized on its direct-current resistance is wrong once the skin depth approaches its dimensions, which at kilohertz fundamentals it does. Skin and proximity effects in slot conductors are derived and the circulating currents in parallel paths that dominate real windings are treated with the transposition schemes that suppress them. Litz wire is assessed for construction, effectiveness and its practical limits in fill factor and termination; form-wound and hairpin conductors are assessed for the same duty. End-winding losses and leakage are quantified. The AC resistance factor is evaluated by analytical models and by finite-element analysis, and the domain of validity of each is stated. The chapter closes with design rules and with the winding design of the two running machines, checked against the loss budget of Chapter 6.</w:t>
+        <w:t>A slot conductor sized on its direct-current resistance is wrong once the skin depth approaches its dimensions, which at kilohertz fundamentals it does. Skin and proximity effects in slot conductors are derived and the circulating currents in parallel paths that dominate real windings are treated with the transposition schemes that suppress them. Litz wire is assessed for construction, effectiveness and its practical limits in fill factor and termination; form-wound and hairpin conductors are assessed for the same duty. End-winding losses and leakage are quantified. The AC resistance factor is evaluated by analytical models and by finite-element analysis, and the domain of validity of each is stated. The chapter closes with design rules and with the winding design of the two running machines, checked against the loss budget set in Chapter 9.</w:t>
       </w:r>
     </w:p>
     <w:p>
@@ -2530,7 +2530,7 @@
         <w:pStyle w:val="Heading4"/>
       </w:pPr>
       <w:r>
-        <w:t>Chapter 9. Core and rotor losses at kilohertz frequencies</w:t>
+        <w:t>Chapter 9. Losses, cooling and the thermal budget at kilohertz frequencies</w:t>
       </w:r>
     </w:p>
     <w:p>
@@ -2538,7 +2538,7 @@
         <w:jc w:val="both"/>
       </w:pPr>
       <w:r>
-        <w:t>Loss models fitted below 400 Hz do not extrapolate to 2 kHz. The chapter shows where loss separation breaks above 1 kHz and how measurement and model fitting are done for high-frequency operation. The soft magnetic materials available are compared as design choices, thin-gauge silicon iron, cobalt iron, amorphous and soft magnetic composites, and the manufacturing effects that degrade them, cutting, stacking, coating and residual stress, are quantified rather than mentioned. The rotor side is treated with equal weight: rotor surface and harmonic losses, eddy currents in sleeves, retention rings and magnets, and the effectiveness and cost of magnet segmentation. Solid-rotor loss modelling is given its own section because the solid rotor is the industrial paradigm's workhorse. The chapter closes with the loss balance of the two running machines against the thermal budget set in Chapter 6.</w:t>
+        <w:t>Loss models fitted below 400 Hz do not extrapolate to 2 kHz, and the air in the gap stops being a passive medium above roughly 100 m/s; this chapter treats every loss mechanism that changes at high speed and the cooling that must remove them. Loss separation is shown to break above 1 kHz, and measurement and model fitting are done for high-frequency operation. The soft magnetic materials are compared as design choices, thin-gauge silicon iron, cobalt iron, amorphous and composites, with the manufacturing effects that degrade them quantified. The rotor side has equal weight: surface and harmonic losses, eddy currents in sleeves, rings and magnets, magnet segmentation, and solid-rotor loss modelling. Aerodynamic and windage losses are developed from laminar Couette flow through Taylor vortices to turbulence, with validated friction correlations, roughness and end effects, and low-density-gas operation. The chapter then turns the thermal problem the right way round for high-speed design: cooling architectures, jackets, in-slot and direct winding cooling, rotor and hollow-shaft cooling, are chosen and lumped-parameter thermal networks built with the air gap as a heat source. Magnet temperature and demagnetisation margin are shown to be the binding thermal constraint in most permanent-magnet high-speed machines. The chapter closes with the loss balance of the two running machines against their thermal budget.</w:t>
       </w:r>
     </w:p>
     <w:p>
@@ -2546,7 +2546,7 @@
         <w:jc w:val="both"/>
       </w:pPr>
       <w:r>
-        <w:t>Sections: 9.1 Loss separation above 1 kHz · 9.2 Soft magnetic materials · 9.3 Manufacturing effects · 9.4 Measurement and model fitting · 9.5 Rotor surface and harmonic losses · 9.6 Eddy currents in sleeves, retention rings and magnets · 9.7 Magnet segmentation · 9.8 Solid-rotor loss modelling · 9.9 Loss balance of the two running machines.</w:t>
+        <w:t>Sections: 9.1 Loss separation above 1 kHz · 9.2 Soft magnetic materials · 9.3 Manufacturing effects · 9.4 Measurement and model fitting · 9.5 Rotor surface and harmonic losses · 9.6 Eddy currents in sleeves, rings and magnets; magnet segmentation · 9.7 Solid-rotor loss modelling · 9.8 Aerodynamic and windage losses: Taylor–Couette flow, correlations, roughness, low-density gas · 9.9 Cooling architectures and thermal networks · 9.10 Magnet temperature and the loss budget of the two running machines.</w:t>
       </w:r>
     </w:p>
     <w:p>
@@ -2554,7 +2554,7 @@
         <w:jc w:val="both"/>
       </w:pPr>
       <w:r>
-        <w:t>Budget: 34 pages, 22 figures, 2 tables. Contributors: A. Belahcen (loss modelling, materials, manufacturing effects) with I. Petrov (rotor losses). DREM boundary: the earlier book's loss chapter covers the conventional frequency range.</w:t>
+        <w:t>Budget: 44 pages, 28 figures, 3 tables. Contributors: A. Belahcen (loss modelling, materials, manufacturing effects), I. Petrov (rotor losses), J. Saari (windage), J. Nerg (thermal networks). DREM boundary: the earlier book's loss and thermal chapters cover the conventional frequency range; only the high-speed departures are treated.</w:t>
       </w:r>
     </w:p>
     <w:p>
@@ -2839,7 +2839,7 @@
               <w:rPr>
                 <w:sz w:val="19"/>
               </w:rPr>
-              <w:t>4, 5</w:t>
+              <w:t>4, 5, 6</w:t>
             </w:r>
           </w:p>
         </w:tc>
@@ -2987,7 +2987,7 @@
               <w:rPr>
                 <w:sz w:val="19"/>
               </w:rPr>
-              <w:t>2, 6, 11</w:t>
+              <w:t>2, 9, 11</w:t>
             </w:r>
           </w:p>
         </w:tc>
@@ -3209,7 +3209,7 @@
               <w:rPr>
                 <w:sz w:val="19"/>
               </w:rPr>
-              <w:t>6</w:t>
+              <w:t>9</w:t>
             </w:r>
           </w:p>
         </w:tc>
@@ -3228,6 +3228,80 @@
                 <w:sz w:val="19"/>
               </w:rPr>
               <w:t>suggested</w:t>
+            </w:r>
+          </w:p>
+        </w:tc>
+      </w:tr>
+      <w:tr>
+        <w:tc>
+          <w:tcPr>
+            <w:tcW w:type="dxa" w:w="2160"/>
+          </w:tcPr>
+          <w:p>
+            <w:r>
+              <w:rPr>
+                <w:sz w:val="19"/>
+              </w:rPr>
+            </w:r>
+            <w:r>
+              <w:rPr>
+                <w:sz w:val="19"/>
+              </w:rPr>
+              <w:t>bearing application specialist</w:t>
+            </w:r>
+          </w:p>
+        </w:tc>
+        <w:tc>
+          <w:tcPr>
+            <w:tcW w:type="dxa" w:w="2160"/>
+          </w:tcPr>
+          <w:p>
+            <w:r>
+              <w:rPr>
+                <w:sz w:val="19"/>
+              </w:rPr>
+            </w:r>
+            <w:r>
+              <w:rPr>
+                <w:sz w:val="19"/>
+              </w:rPr>
+              <w:t>industry, to be identified</w:t>
+            </w:r>
+          </w:p>
+        </w:tc>
+        <w:tc>
+          <w:tcPr>
+            <w:tcW w:type="dxa" w:w="2160"/>
+          </w:tcPr>
+          <w:p>
+            <w:r>
+              <w:rPr>
+                <w:sz w:val="19"/>
+              </w:rPr>
+            </w:r>
+            <w:r>
+              <w:rPr>
+                <w:sz w:val="19"/>
+              </w:rPr>
+              <w:t>6</w:t>
+            </w:r>
+          </w:p>
+        </w:tc>
+        <w:tc>
+          <w:tcPr>
+            <w:tcW w:type="dxa" w:w="2160"/>
+          </w:tcPr>
+          <w:p>
+            <w:r>
+              <w:rPr>
+                <w:sz w:val="19"/>
+              </w:rPr>
+            </w:r>
+            <w:r>
+              <w:rPr>
+                <w:sz w:val="19"/>
+              </w:rPr>
+              <w:t>open</w:t>
             </w:r>
           </w:p>
         </w:tc>

</xml_diff>

<commit_message>
Open Sopanen's three chapters to his wider network, not just his group
His letter now says he would bring in specialists from his professional
network for the parts outside his group's daily work, in particular
lubrication regimes, bearing life and seal design as practised in
industry, and that he takes responsibility for the coherence of all
three chapters. The email asks him to build the team as he sees fit
rather than naming only group members.

The table of contents follows: the Chapter 6 bearing specialist moves
from 'open' to 'to be named through J. Sopanen's network', which closes
the last unattributed slot in Part II.

Co-Authored-By: Claude Opus 5 <noreply@anthropic.com>
Claude-Session: https://claude.ai/code/session_01YTsySEafbpGxYLQMAGUGjT
</commit_message>
<xml_diff>
--- a/chapter1/Annotated_TOC.docx
+++ b/chapter1/Annotated_TOC.docx
@@ -2572,7 +2572,7 @@
         <w:jc w:val="both"/>
       </w:pPr>
       <w:r>
-        <w:t>Budget: 30 pages, 20 figures, 3 tables. Contributors: J. Sopanen's group (bearing-rotor interaction, fluid-film and magnetic bearings); an industrial bearing application specialist to be identified for lubrication, life and seals. DREM boundary: not covered in the earlier book. New: bearing losses and seal windage placed in the high-speed loss budget.</w:t>
+        <w:t>Budget: 30 pages, 20 figures, 3 tables. Contributors: J. Sopanen's group (bearing-rotor interaction, fluid-film and magnetic bearings); an industrial bearing application specialist, to be named from J. Sopanen's professional network, for the lubrication regimes, bearing life and seals as they are practised in industry. DREM boundary: not covered in the earlier book. New: bearing losses and seal windage placed in the high-speed loss budget.</w:t>
       </w:r>
     </w:p>
     <w:p>
@@ -3419,7 +3419,7 @@
               <w:rPr>
                 <w:sz w:val="19"/>
               </w:rPr>
-              <w:t>industry, to be identified</w:t>
+              <w:t>industry, through J. Sopanen's network</w:t>
             </w:r>
           </w:p>
         </w:tc>
@@ -3455,7 +3455,7 @@
               <w:rPr>
                 <w:sz w:val="19"/>
               </w:rPr>
-              <w:t>open</w:t>
+              <w:t>to be named</w:t>
             </w:r>
           </w:p>
         </w:tc>

</xml_diff>

<commit_message>
Letter of support and invitation for P. Peltoniemi
His letter argues from power electronics and makes a third distinct
case: the machine is specified first and its converter procured after,
but at high speed the switch decides the pole number; power-electronics
books assume a well-behaved load while machine books assume a near
sinusoidal supply, so nobody treats the low pulse ratio, the rotor
harmonics, the insulation stress and the bearing currents as one
problem; and wide-bandgap devices have moved what is buildable faster
than the design practice has followed.

His email records that he already agreed, and asks him to build the
chapter team from LUT and his own network, with Aarniovuori and
Hinkkanen or O. Pyrhonen offered as suggestions rather than as a plan.
His status in the contributor table moves to agreed in principle.

Co-Authored-By: Claude Opus 5 <noreply@anthropic.com>
Claude-Session: https://claude.ai/code/session_01YTsySEafbpGxYLQMAGUGjT
</commit_message>
<xml_diff>
--- a/chapter1/Annotated_TOC.docx
+++ b/chapter1/Annotated_TOC.docx
@@ -3289,7 +3289,7 @@
               <w:rPr>
                 <w:sz w:val="19"/>
               </w:rPr>
-              <w:t>11</w:t>
+              <w:t>11 lead</w:t>
             </w:r>
           </w:p>
         </w:tc>
@@ -3307,7 +3307,7 @@
               <w:rPr>
                 <w:sz w:val="19"/>
               </w:rPr>
-              <w:t>to be invited</w:t>
+              <w:t>agreed in principle</w:t>
             </w:r>
           </w:p>
         </w:tc>

</xml_diff>

<commit_message>
Scope Peltoniemi to the converter sections of Chapter 11
He is asked for the converter itself, not for the control sections or
the harmonic-loss section, and no longer described as leading a chapter
that includes work by colleagues at another university. His letter,
his email, the contributor table and the Chapter 11 contributor note
all say the same thing; the letter is trimmed back to the length of
the other two.

Co-Authored-By: Claude Opus 5 <noreply@anthropic.com>
Claude-Session: https://claude.ai/code/session_01YTsySEafbpGxYLQMAGUGjT
</commit_message>
<xml_diff>
--- a/chapter1/Annotated_TOC.docx
+++ b/chapter1/Annotated_TOC.docx
@@ -2748,7 +2748,7 @@
         <w:jc w:val="both"/>
       </w:pPr>
       <w:r>
-        <w:t>Budget: 40 pages, 26 figures, 2 tables. Contributors: P. Peltoniemi (converter and control), L. Aarniovuori (harmonic losses), with M. Hinkkanen or O. Pyrhönen on control at low pulse ratios. DREM boundary: not covered in the earlier book.</w:t>
+        <w:t>Budget: 40 pages, 26 figures, 2 tables. Contributors: P. Peltoniemi (the converter sections, 11.1 and 11.3 to 11.7, and the converter side of 11.11), L. Aarniovuori (harmonic losses and rotor heating, 11.2), M. Hinkkanen or O. Pyrhönen (control at low pulse ratios, 11.8 to 11.10). DREM boundary: not covered in the earlier book.</w:t>
       </w:r>
     </w:p>
     <w:p>
@@ -3289,7 +3289,7 @@
               <w:rPr>
                 <w:sz w:val="19"/>
               </w:rPr>
-              <w:t>11 lead</w:t>
+              <w:t>11, converter sections</w:t>
             </w:r>
           </w:p>
         </w:tc>

</xml_diff>

<commit_message>
Restore Peltoniemi as lead of the drive chapter, per the sent email
The email that went out asks him to lead the chapter and to share the
work with colleagues from the LUT power electronics group or his own
network, so the letter no longer says the control sections go to others
and instead has him answering for the chapter as a whole. The
contributor table and the Chapter 11 note follow, keeping the section
split visible: he writes 11.1 and 11.3 to 11.7, Aarniovuori 11.2,
Hinkkanen or O. Pyrhonen 11.8 to 11.10.

Co-Authored-By: Claude Opus 5 <noreply@anthropic.com>
Claude-Session: https://claude.ai/code/session_01YTsySEafbpGxYLQMAGUGjT
</commit_message>
<xml_diff>
--- a/chapter1/Annotated_TOC.docx
+++ b/chapter1/Annotated_TOC.docx
@@ -2748,7 +2748,7 @@
         <w:jc w:val="both"/>
       </w:pPr>
       <w:r>
-        <w:t>Budget: 40 pages, 26 figures, 2 tables. Contributors: P. Peltoniemi (the converter sections, 11.1 and 11.3 to 11.7, and the converter side of 11.11), L. Aarniovuori (harmonic losses and rotor heating, 11.2), M. Hinkkanen or O. Pyrhönen (control at low pulse ratios, 11.8 to 11.10). DREM boundary: not covered in the earlier book.</w:t>
+        <w:t>Budget: 40 pages, 26 figures, 2 tables. Contributors: P. Peltoniemi leads the chapter and writes the converter sections, 11.1 and 11.3 to 11.7, with colleagues from the LUT power electronics group; L. Aarniovuori (harmonic losses and rotor heating, 11.2); M. Hinkkanen or O. Pyrhönen (control at low pulse ratios, 11.8 to 11.10). DREM boundary: not covered in the earlier book.</w:t>
       </w:r>
     </w:p>
     <w:p>
@@ -3289,7 +3289,7 @@
               <w:rPr>
                 <w:sz w:val="19"/>
               </w:rPr>
-              <w:t>11, converter sections</w:t>
+              <w:t>11 lead</w:t>
             </w:r>
           </w:p>
         </w:tc>

</xml_diff>

<commit_message>
Bring LUT turbomachinery into the air-gap flow and the speed rationale
A. Jaatinen-Varri and J. Tiainen are added as contributors, aimed at
the fluid-dynamic work rather than at thermal design as such: the
air-gap flow that produces windage in 9.8 and convection in 10.5, which
the proposal already claims should come from one model, and a new 2.2
stating why the driven machine wants the speed at all, from specific
speed and the aerodynamic optimum. That argument was missing: the book
explained how to build a high-speed machine but never why the
application demands one.

Chapter 2 sections renumber accordingly and Saari's block is adjusted
so that he and the turbomachinery contributors are not invited to the
same section. The readership note now cites the High-Speed Day at LUT
as evidence that this audience gathers.

Co-Authored-By: Claude Opus 5 <noreply@anthropic.com>
Claude-Session: https://claude.ai/code/session_01YTsySEafbpGxYLQMAGUGjT
</commit_message>
<xml_diff>
--- a/chapter1/Annotated_TOC.docx
+++ b/chapter1/Annotated_TOC.docx
@@ -128,7 +128,7 @@
         <w:t>Readership.</w:t>
       </w:r>
       <w:r>
-        <w:t xml:space="preserve"> R&amp;D and application engineers at compressor, turbomachinery, e-mobility and aerospace companies; drive-system engineers who must supply such machines; graduate students and researchers in electrical machines and drives. End-of-chapter problems and worked examples make it usable as a supplementary text in graduate courses on electrical machine and drive design.</w:t>
+        <w:t xml:space="preserve"> R&amp;D and application engineers at compressor, turbomachinery, e-mobility and aerospace companies. That this readership exists as a community, and not only as a market, is visible in events such as the High-Speed Day held at LUT University in 2026, which drew machine, drive and turbomachinery engineers from industry and academia to the same room. Also: drive-system engineers who must supply such machines; graduate students and researchers in electrical machines and drives. End-of-chapter problems and worked examples make it usable as a supplementary text in graduate courses on electrical machine and drive design.</w:t>
       </w:r>
     </w:p>
     <w:p>
@@ -2420,7 +2420,7 @@
         <w:jc w:val="both"/>
       </w:pPr>
       <w:r>
-        <w:t>The chapter establishes why high-speed machines exist and why the two paradigms diverge. In industry the converter made it possible to move the speed conversion from a gearbox into the electrical domain, and the gearbox was deleted: centrifugal compressors, wastewater aeration blowers, organic Rankine cycle and turbo-expander generators, and subsea and hermetic process machines are treated with their economics of availability, oil-free operation and total cost of ownership. In mobile applications the converter was needed anyway and high speed bought mass instead, so the gearbox was kept: electric traction and its geared high-speed optimum, hybrid-electric and all-electric aircraft propulsion and generation, and electrically assisted turbochargers and turbo-compounding above 100 000 r/min. Emerging drivers are surveyed, including heat-pump and hydrogen and cryogenic compression and flywheel storage. The chapter then presents a survey of built and published high-speed machines, spanning several decades of power and speed, and maps them onto the three classification criteria of Chapter 1; this is where the fP criterion receives its calibration. It closes by specifying the two running machines and stating the architecture-selection logic, total cost of ownership against specific power, that governs every later trade-off.</w:t>
+        <w:t>The chapter establishes why high-speed machines exist and why the two paradigms diverge. It begins from the driven machine rather than the motor, because that is where the speed requirement originates: a centrifugal compressor or a turbo-expander has an aerodynamic optimum fixed by its specific speed, and that optimum, not any electrical consideration, is what asks for 30 000 r/min. In industry the converter then made it possible to move the speed conversion from a gearbox into the electrical domain, and the gearbox was deleted: centrifugal compressors, wastewater aeration blowers, organic Rankine cycle and turbo-expander generators, and subsea and hermetic process machines are treated with their economics of availability, oil-free operation and total cost of ownership. In mobile applications the converter was needed anyway and high speed bought mass instead, so the gearbox was kept: electric traction and its geared high-speed optimum, hybrid-electric and all-electric aircraft propulsion and generation, and electrically assisted turbochargers and turbo-compounding above 100 000 r/min. Emerging drivers are surveyed, including heat-pump and hydrogen and cryogenic compression and flywheel storage. The chapter then presents a survey of built and published high-speed machines, spanning several decades of power and speed, and maps them onto the three classification criteria of Chapter 1; this is where the fP criterion receives its calibration. It closes by specifying the two running machines and stating the architecture-selection logic, total cost of ownership against specific power, that governs every later trade-off.</w:t>
       </w:r>
     </w:p>
     <w:p>
@@ -2428,7 +2428,7 @@
         <w:jc w:val="both"/>
       </w:pPr>
       <w:r>
-        <w:t>Sections: 2.1 The direct-drive transition in industry · 2.2 Gearless industrial units: compressors, aeration blowers, ORC and turbo-expanders · 2.3 Subsea and hermetic process machines · 2.4 Electric traction and the geared high-speed optimum · 2.5 Aerospace and hybrid-electric propulsion · 2.6 e-Turbochargers, turbo-compounding and the &gt;100 000 r/min class · 2.7 Emerging drivers: heat pumps, hydrogen and cryogenic compression, flywheels · 2.8 Architecture selection: total cost of ownership against specific power · 2.9 A survey of built machines: calibrating v_tip, n√P and fP · 2.10 The two running machines specified.</w:t>
+        <w:t>Sections: 2.1 The direct-drive transition in industry · 2.2 Why the driven machine sets the speed: specific speed and the turbomachinery optimum · 2.3 Gearless industrial units: compressors, aeration blowers, ORC and turbo-expanders · 2.4 Subsea and hermetic process machines · 2.5 Electric traction and the geared high-speed optimum · 2.6 Aerospace and hybrid-electric propulsion · 2.7 e-Turbochargers, turbo-compounding and the &gt;100 000 r/min class · 2.8 Emerging drivers: heat pumps, hydrogen and cryogenic compression, flywheels · 2.9 Architecture selection: total cost of ownership against specific power · 2.10 A survey of built machines: calibrating v_tip, n√P and fP · 2.11 The two running machines specified.</w:t>
       </w:r>
     </w:p>
     <w:p>
@@ -2436,7 +2436,7 @@
         <w:jc w:val="both"/>
       </w:pPr>
       <w:r>
-        <w:t>Budget: 34 pages, 18 figures, 3 tables. New: the machine survey and the calibrated criteria; the architecture-selection logic. Contributors: J. Saari (industrial machines); LUT turbomachinery group to be approached for the process side.</w:t>
+        <w:t>Budget: 34 pages, 18 figures, 3 tables. New: the machine survey and the calibrated criteria; the architecture-selection logic; §2.2, which states the speed requirement from the driven machine's side rather than the motor's. Contributors: J. Saari (industrial machines); A. Jaatinen-Värri and J. Tiainen (§2.2, specific speed and the aerodynamic optimum).</w:t>
       </w:r>
     </w:p>
     <w:p>
@@ -2676,7 +2676,7 @@
         <w:jc w:val="both"/>
       </w:pPr>
       <w:r>
-        <w:t>Budget: 30 pages, 20 figures, 3 tables. Contributors: A. Belahcen (loss modelling, materials, manufacturing effects), I. Petrov (rotor losses), J. Saari (windage). DREM boundary: the earlier book's loss chapters cover the conventional frequency range; only the high-speed departures are treated.</w:t>
+        <w:t>Budget: 30 pages, 20 figures, 3 tables. Contributors: A. Belahcen (loss modelling, materials, manufacturing effects), I. Petrov (rotor losses), J. Saari (windage correlations for high-speed machines), with A. Jaatinen-Värri and J. Tiainen on the flow regimes, roughness and end effects of §9.8. DREM boundary: the earlier book's loss chapters cover the conventional frequency range; only the high-speed departures are treated.</w:t>
       </w:r>
     </w:p>
     <w:p>
@@ -2708,7 +2708,7 @@
         <w:jc w:val="both"/>
       </w:pPr>
       <w:r>
-        <w:t>Budget: 28 pages, 18 figures, 3 tables. Contributors: J. Nerg lead (thermal networks, cooling architectures, transients), A. Belahcen (magnet temperature and demagnetisation margin), J. Saari (air-gap convection, from the same flow model as the windage of §9.8). DREM boundary: the earlier book covers conventional cooling and thermal-resistance modelling and is referenced for them; only what high speed changes is treated here. New: the rotor thermal path behind the retaining sleeve, and windage and air-gap convection derived from one flow model.</w:t>
+        <w:t>Budget: 28 pages, 18 figures, 3 tables. Contributors: J. Nerg lead (thermal networks, cooling architectures, transients), A. Belahcen (magnet temperature and demagnetisation margin), A. Jaatinen-Värri and J. Tiainen (§10.5 air-gap convection, from the same flow model as the windage of §9.8), J. Saari (the machine-side windage link). DREM boundary: the earlier book covers conventional cooling and thermal-resistance modelling and is referenced for them; only what high speed changes is treated here. New: the rotor thermal path behind the retaining sleeve, and windage and air-gap convection derived from one flow model.</w:t>
       </w:r>
     </w:p>
     <w:p>
@@ -3141,7 +3141,155 @@
               <w:rPr>
                 <w:sz w:val="19"/>
               </w:rPr>
-              <w:t>2, 9.8, 10.5, 12</w:t>
+              <w:t>2, 9.8, 12</w:t>
+            </w:r>
+          </w:p>
+        </w:tc>
+        <w:tc>
+          <w:tcPr>
+            <w:tcW w:type="dxa" w:w="2160"/>
+          </w:tcPr>
+          <w:p>
+            <w:r>
+              <w:rPr>
+                <w:sz w:val="19"/>
+              </w:rPr>
+            </w:r>
+            <w:r>
+              <w:rPr>
+                <w:sz w:val="19"/>
+              </w:rPr>
+              <w:t>to be invited</w:t>
+            </w:r>
+          </w:p>
+        </w:tc>
+      </w:tr>
+      <w:tr>
+        <w:tc>
+          <w:tcPr>
+            <w:tcW w:type="dxa" w:w="2160"/>
+          </w:tcPr>
+          <w:p>
+            <w:r>
+              <w:rPr>
+                <w:sz w:val="19"/>
+              </w:rPr>
+            </w:r>
+            <w:r>
+              <w:rPr>
+                <w:sz w:val="19"/>
+              </w:rPr>
+              <w:t>Ahti Jaatinen-Värri</w:t>
+            </w:r>
+          </w:p>
+        </w:tc>
+        <w:tc>
+          <w:tcPr>
+            <w:tcW w:type="dxa" w:w="2160"/>
+          </w:tcPr>
+          <w:p>
+            <w:r>
+              <w:rPr>
+                <w:sz w:val="19"/>
+              </w:rPr>
+            </w:r>
+            <w:r>
+              <w:rPr>
+                <w:sz w:val="19"/>
+              </w:rPr>
+              <w:t>LUT, turbomachinery</w:t>
+            </w:r>
+          </w:p>
+        </w:tc>
+        <w:tc>
+          <w:tcPr>
+            <w:tcW w:type="dxa" w:w="2160"/>
+          </w:tcPr>
+          <w:p>
+            <w:r>
+              <w:rPr>
+                <w:sz w:val="19"/>
+              </w:rPr>
+            </w:r>
+            <w:r>
+              <w:rPr>
+                <w:sz w:val="19"/>
+              </w:rPr>
+              <w:t>2.2, 9.8, 10.5</w:t>
+            </w:r>
+          </w:p>
+        </w:tc>
+        <w:tc>
+          <w:tcPr>
+            <w:tcW w:type="dxa" w:w="2160"/>
+          </w:tcPr>
+          <w:p>
+            <w:r>
+              <w:rPr>
+                <w:sz w:val="19"/>
+              </w:rPr>
+            </w:r>
+            <w:r>
+              <w:rPr>
+                <w:sz w:val="19"/>
+              </w:rPr>
+              <w:t>to be invited</w:t>
+            </w:r>
+          </w:p>
+        </w:tc>
+      </w:tr>
+      <w:tr>
+        <w:tc>
+          <w:tcPr>
+            <w:tcW w:type="dxa" w:w="2160"/>
+          </w:tcPr>
+          <w:p>
+            <w:r>
+              <w:rPr>
+                <w:sz w:val="19"/>
+              </w:rPr>
+            </w:r>
+            <w:r>
+              <w:rPr>
+                <w:sz w:val="19"/>
+              </w:rPr>
+              <w:t>Jonna Tiainen</w:t>
+            </w:r>
+          </w:p>
+        </w:tc>
+        <w:tc>
+          <w:tcPr>
+            <w:tcW w:type="dxa" w:w="2160"/>
+          </w:tcPr>
+          <w:p>
+            <w:r>
+              <w:rPr>
+                <w:sz w:val="19"/>
+              </w:rPr>
+            </w:r>
+            <w:r>
+              <w:rPr>
+                <w:sz w:val="19"/>
+              </w:rPr>
+              <w:t>The Switch</w:t>
+            </w:r>
+          </w:p>
+        </w:tc>
+        <w:tc>
+          <w:tcPr>
+            <w:tcW w:type="dxa" w:w="2160"/>
+          </w:tcPr>
+          <w:p>
+            <w:r>
+              <w:rPr>
+                <w:sz w:val="19"/>
+              </w:rPr>
+            </w:r>
+            <w:r>
+              <w:rPr>
+                <w:sz w:val="19"/>
+              </w:rPr>
+              <w:t>2.2, 9.8, 10.5, 12</w:t>
             </w:r>
           </w:p>
         </w:tc>

</xml_diff>

<commit_message>
Add J. Ikaheimo (ABB) alongside J. Saari, on different sections
They are complementary rather than duplicated: Saari is the source of
the windage and thermal correlations and knows the compressor case,
while Ikaheimo brings a manufacturer's practice. He takes 3.2, the
solid-rotor induction machine the book calls the industrial workhorse
and which ABB actually builds, 12.3 manufacture and tolerance control,
and 12.5 qualification against the standards, plus photographs of built
machines across the book. Saari keeps 12.1 and loses 12.5.

Two industrial sources also give the case-study data a second route,
which matters because the compressor data clearance is the single
largest risk in the proposal, and they keep the book from reading as
one manufacturer's practice.

Co-Authored-By: Claude Opus 5 <noreply@anthropic.com>
Claude-Session: https://claude.ai/code/session_01YTsySEafbpGxYLQMAGUGjT
</commit_message>
<xml_diff>
--- a/chapter1/Annotated_TOC.docx
+++ b/chapter1/Annotated_TOC.docx
@@ -2468,7 +2468,7 @@
         <w:jc w:val="both"/>
       </w:pPr>
       <w:r>
-        <w:t>Budget: 34 pages, 24 figures, 2 tables. DREM boundary: topologies are compared only on their high-speed behaviour; their general theory is referenced, which is what keeps this chapter short.</w:t>
+        <w:t>Budget: 34 pages, 24 figures, 2 tables. Contributors: authors, with J. Ikäheimo on §3.2, the solid-rotor induction machine, which is written from the practice of a manufacturer that builds them rather than from the literature. DREM boundary: topologies are compared only on their high-speed behaviour; their general theory is referenced, which is what keeps this chapter short.</w:t>
       </w:r>
     </w:p>
     <w:p>
@@ -2764,7 +2764,7 @@
         <w:jc w:val="both"/>
       </w:pPr>
       <w:r>
-        <w:t>Two complete industrial designs are carried from specification to measured performance. The first is the gearless compressor drive that has served as the industrial running machine throughout the book, now assembled: its rotor, bearings, cooling, electromagnetic design and converter are brought together, built and tested. The second is an organic Rankine cycle turbogenerator, chosen because it exercises the generator side and the high-temperature environment. Manufacture and tolerance control are treated as part of the design, since at high speed they are. The test rig, instrumentation and loss segregation at high speed are described in enough detail to be reproduced, with calorimetric methods where electrical methods fail. Qualification is addressed against the standards that industrial customers require, API 617 and API 541, IEC 60034-25 for converter-fed machines, ISO 21940 balancing grades and ISO 20816 vibration. The chapter closes with the failure modes observed in industrial high-speed machines and the design lessons drawn from them.</w:t>
+        <w:t>Two complete industrial designs are carried from specification to measured performance. The first is the gearless compressor drive that has served as the industrial running machine throughout the book, now assembled: its rotor, bearings, cooling, electromagnetic design and converter are brought together, built and tested. The second is an organic Rankine cycle turbogenerator, chosen because it exercises the generator side and the high-temperature environment. Manufacture and tolerance control are treated as part of the design, since at high speed they are, and they are written by an engineer from a manufacturer that builds these machines rather than inferred from the outside. The test rig, instrumentation and loss segregation at high speed are described in enough detail to be reproduced, with calorimetric methods where electrical methods fail. Qualification is addressed against the standards that industrial customers require, API 617 and API 541, IEC 60034-25 for converter-fed machines, ISO 21940 balancing grades and ISO 20816 vibration. The chapter closes with the failure modes observed in industrial high-speed machines and the design lessons drawn from them.</w:t>
       </w:r>
     </w:p>
     <w:p>
@@ -2780,7 +2780,7 @@
         <w:jc w:val="both"/>
       </w:pPr>
       <w:r>
-        <w:t>Budget: 28 pages, 22 figures, 3 tables. Contributors: authors, J. Saari (compressor case), L. Aarniovuori (loss measurement). New: measured case data.</w:t>
+        <w:t>Budget: 28 pages, 22 figures, 3 tables. Contributors: authors, J. Saari (the compressor case, 12.1), J. Ikäheimo (manufacture and tolerance control, 12.3, and qualification against the standards, 12.5, both written from a manufacturer's practice), L. Aarniovuori (test rig and loss segregation, 12.4), J. Tiainen (industrial perspective). New: measured case data, and photographs of built machines and rotors supplied by the industrial contributors, which no competing title has.</w:t>
       </w:r>
     </w:p>
     <w:p>
@@ -3141,7 +3141,7 @@
               <w:rPr>
                 <w:sz w:val="19"/>
               </w:rPr>
-              <w:t>2, 9.8, 12</w:t>
+              <w:t>2, 9.8, 12.1</w:t>
             </w:r>
           </w:p>
         </w:tc>
@@ -3160,6 +3160,80 @@
                 <w:sz w:val="19"/>
               </w:rPr>
               <w:t>to be invited</w:t>
+            </w:r>
+          </w:p>
+        </w:tc>
+      </w:tr>
+      <w:tr>
+        <w:tc>
+          <w:tcPr>
+            <w:tcW w:type="dxa" w:w="2160"/>
+          </w:tcPr>
+          <w:p>
+            <w:r>
+              <w:rPr>
+                <w:sz w:val="19"/>
+              </w:rPr>
+            </w:r>
+            <w:r>
+              <w:rPr>
+                <w:sz w:val="19"/>
+              </w:rPr>
+              <w:t>Jouni Ikäheimo</w:t>
+            </w:r>
+          </w:p>
+        </w:tc>
+        <w:tc>
+          <w:tcPr>
+            <w:tcW w:type="dxa" w:w="2160"/>
+          </w:tcPr>
+          <w:p>
+            <w:r>
+              <w:rPr>
+                <w:sz w:val="19"/>
+              </w:rPr>
+            </w:r>
+            <w:r>
+              <w:rPr>
+                <w:sz w:val="19"/>
+              </w:rPr>
+              <w:t>ABB, high-speed motors</w:t>
+            </w:r>
+          </w:p>
+        </w:tc>
+        <w:tc>
+          <w:tcPr>
+            <w:tcW w:type="dxa" w:w="2160"/>
+          </w:tcPr>
+          <w:p>
+            <w:r>
+              <w:rPr>
+                <w:sz w:val="19"/>
+              </w:rPr>
+            </w:r>
+            <w:r>
+              <w:rPr>
+                <w:sz w:val="19"/>
+              </w:rPr>
+              <w:t>3.2, 12.3, 12.5; photographs and machine material throughout</w:t>
+            </w:r>
+          </w:p>
+        </w:tc>
+        <w:tc>
+          <w:tcPr>
+            <w:tcW w:type="dxa" w:w="2160"/>
+          </w:tcPr>
+          <w:p>
+            <w:r>
+              <w:rPr>
+                <w:sz w:val="19"/>
+              </w:rPr>
+            </w:r>
+            <w:r>
+              <w:rPr>
+                <w:sz w:val="19"/>
+              </w:rPr>
+              <w:t>agreed in principle</w:t>
             </w:r>
           </w:p>
         </w:tc>
@@ -3791,7 +3865,15 @@
         <w:jc w:val="both"/>
       </w:pPr>
       <w:r>
-        <w:t>Chapter 1 complete; the annotated table of contents above; a partial Chapter 7 demonstrating the inverted sizing procedure on one running machine, to evidence the design-book claim; author and contributor biographies; the competing-titles analysis.</w:t>
+        <w:t>Chapter 1 complete; the annotated table of contents above; a partial Chapter 7 demonstrating the inverted sizing procedure on one running machine, to evidence the design-book claim; author and contributor biographies; letters of support from the named contributors; the competing-titles analysis.</w:t>
+      </w:r>
+    </w:p>
+    <w:p>
+      <w:pPr>
+        <w:jc w:val="both"/>
+      </w:pPr>
+      <w:r>
+        <w:t>The contributors from industry also offer photographs of built high-speed machines, rotors and sleeves. Competing titles are illustrated almost entirely with line drawings, so this is worth stating to the publisher explicitly: the industrial contributors are the copyright holders, which removes the permission problem that usually keeps such photographs out of textbooks.</w:t>
       </w:r>
     </w:p>
     <w:sectPr>

</xml_diff>

<commit_message>
Ikaheimo: adopt the sent email wording, broaden to both induction topologies
Takes the author's revision of the email and repairs it: the list of
places had lost its lead-in, leaving three sentence fragments with no
main verb, and 'open anything else than given below' is rewritten. His
scope broadens from the solid-rotor section alone to both induction
sections, 3.2 and 3.3, which is what the revised email asks for; the
letter and the table of contents follow.

Co-Authored-By: Claude Opus 5 <noreply@anthropic.com>
Claude-Session: https://claude.ai/code/session_01YTsySEafbpGxYLQMAGUGjT
</commit_message>
<xml_diff>
--- a/chapter1/Annotated_TOC.docx
+++ b/chapter1/Annotated_TOC.docx
@@ -2468,7 +2468,7 @@
         <w:jc w:val="both"/>
       </w:pPr>
       <w:r>
-        <w:t>Budget: 34 pages, 24 figures, 2 tables. Contributors: authors, with J. Ikäheimo on §3.2, the solid-rotor induction machine, which is written from the practice of a manufacturer that builds them rather than from the literature. DREM boundary: topologies are compared only on their high-speed behaviour; their general theory is referenced, which is what keeps this chapter short.</w:t>
+        <w:t>Budget: 34 pages, 24 figures, 2 tables. Contributors: authors, with J. Ikäheimo on §3.2 and §3.3, the solid-rotor and laminated-rotor induction machines, written from the practice of a manufacturer that builds them rather than from the literature. DREM boundary: topologies are compared only on their high-speed behaviour; their general theory is referenced, which is what keeps this chapter short.</w:t>
       </w:r>
     </w:p>
     <w:p>
@@ -3215,7 +3215,7 @@
               <w:rPr>
                 <w:sz w:val="19"/>
               </w:rPr>
-              <w:t>3.2, 12.3, 12.5; photographs and machine material throughout</w:t>
+              <w:t>3.2 and 3.3, 12.3, 12.5; photographs and machine material throughout</w:t>
             </w:r>
           </w:p>
         </w:tc>

</xml_diff>

<commit_message>
Place J. Pippuri-Makelainen on Chapter 13, and record the Voltcar permission risk
She manages the Voltcar project, whose traction machine is the book's
mobile running machine: specified in Chapter 2, carried through
Chapters 4 to 11 and assembled in 13.1. She joins as co-author of
Chapter 13 on that machine, with the authors keeping ownership of the
chapter and of 13.7, the closing synthesis of the two paradigms, which
is the book's own argument and should stay in the authors' voice.

The larger point is recorded in the ownership note: nobody has asked
the project whether its results may be published. That has to be
settled whether or not she writes, and before the proposal goes out,
because a late refusal would cost the mobile half of the book rather
than a section.

Co-Authored-By: Claude Opus 5 <noreply@anthropic.com>
Claude-Session: https://claude.ai/code/session_01YTsySEafbpGxYLQMAGUGjT
</commit_message>
<xml_diff>
--- a/chapter1/Annotated_TOC.docx
+++ b/chapter1/Annotated_TOC.docx
@@ -2812,7 +2812,7 @@
         <w:jc w:val="both"/>
       </w:pPr>
       <w:r>
-        <w:t>Budget: 30 pages, 24 figures, 3 tables. Contributors: authors (Voltcar), an aerospace contributor to be invited for 13.2. New: measured case data from a current EU project.</w:t>
+        <w:t>Budget: 30 pages, 24 figures, 3 tables. Owner: the authors, who also write §13.7, the closing synthesis of the two paradigms. Co-authors: J. Pippuri-Mäkeläinen of VTT, who manages the Voltcar project, on §13.1; an aerospace contributor for §13.2. New: measured case data from a current EU project, used with the project’s agreement.</w:t>
       </w:r>
     </w:p>
     <w:p>
@@ -4029,6 +4029,80 @@
                 <w:sz w:val="19"/>
               </w:rPr>
               <w:t>P. Peltoniemi</w:t>
+            </w:r>
+          </w:p>
+        </w:tc>
+      </w:tr>
+      <w:tr>
+        <w:tc>
+          <w:tcPr>
+            <w:tcW w:type="dxa" w:w="2160"/>
+          </w:tcPr>
+          <w:p>
+            <w:r>
+              <w:rPr>
+                <w:sz w:val="19"/>
+              </w:rPr>
+            </w:r>
+            <w:r>
+              <w:rPr>
+                <w:sz w:val="19"/>
+              </w:rPr>
+              <w:t>Jenni Pippuri-Mäkeläinen</w:t>
+            </w:r>
+          </w:p>
+        </w:tc>
+        <w:tc>
+          <w:tcPr>
+            <w:tcW w:type="dxa" w:w="2160"/>
+          </w:tcPr>
+          <w:p>
+            <w:r>
+              <w:rPr>
+                <w:sz w:val="19"/>
+              </w:rPr>
+            </w:r>
+            <w:r>
+              <w:rPr>
+                <w:sz w:val="19"/>
+              </w:rPr>
+              <w:t>VTT, manager of the Voltcar project</w:t>
+            </w:r>
+          </w:p>
+        </w:tc>
+        <w:tc>
+          <w:tcPr>
+            <w:tcW w:type="dxa" w:w="2160"/>
+          </w:tcPr>
+          <w:p>
+            <w:r>
+              <w:rPr>
+                <w:sz w:val="19"/>
+              </w:rPr>
+            </w:r>
+            <w:r>
+              <w:rPr>
+                <w:sz w:val="19"/>
+              </w:rPr>
+              <w:t>13, the Voltcar machine of §13.1</w:t>
+            </w:r>
+          </w:p>
+        </w:tc>
+        <w:tc>
+          <w:tcPr>
+            <w:tcW w:type="dxa" w:w="2160"/>
+          </w:tcPr>
+          <w:p>
+            <w:r>
+              <w:rPr>
+                <w:sz w:val="19"/>
+              </w:rPr>
+            </w:r>
+            <w:r>
+              <w:rPr>
+                <w:sz w:val="19"/>
+              </w:rPr>
+              <w:t>the authors</w:t>
             </w:r>
           </w:p>
         </w:tc>

</xml_diff>

<commit_message>
Rebuild Chapter 1's roadmap for the fourteen-chapter structure
Section 1.6.2 now names Chapter 11 as the converter interface and
Chapter 12 as control at high fundamental frequency, stating why the
second follows from the first: where the switching frequency is no
longer far above the fundamental, the delays and the discrete-time
nature of the regulator become constraints on the machine rather than
details of its implementation. The case studies are Chapters 13 and 14.

Reject-all still reproduces the author's original text, 267 of 267
paragraphs, and all thirteen checks pass. The clean copy is regenerated
from it. Chapter 14's title in the table of contents follows the
author's edit and is now traction only.

Co-Authored-By: Claude Opus 5 <noreply@anthropic.com>
Claude-Session: https://claude.ai/code/session_01YTsySEafbpGxYLQMAGUGjT
</commit_message>
<xml_diff>
--- a/chapter1/Annotated_TOC.docx
+++ b/chapter1/Annotated_TOC.docx
@@ -1988,7 +1988,7 @@
               <w:rPr>
                 <w:sz w:val="19"/>
               </w:rPr>
-              <w:t>Mobile case studies: traction, aerospace and e-turbo</w:t>
+              <w:t>Mobile case studies: traction</w:t>
             </w:r>
           </w:p>
         </w:tc>
@@ -2942,7 +2942,7 @@
         <w:pStyle w:val="Heading4"/>
       </w:pPr>
       <w:r>
-        <w:t>Chapter 14. Mobile case studies: traction, aerospace and e-turbo</w:t>
+        <w:t>Chapter 14. Mobile case studies: traction</w:t>
       </w:r>
     </w:p>
     <w:p>

</xml_diff>